<commit_message>
Qtasnim: CRUD operation and fetch-send external URL
</commit_message>
<xml_diff>
--- a/Qtasnim Digital Teknologi/Qtasnim Digital Teknologi Documentation.docx
+++ b/Qtasnim Digital Teknologi/Qtasnim Digital Teknologi Documentation.docx
@@ -293,91 +293,9 @@
     </w:p>
     <w:p>
       <w:pPr>
-        <w:jc w:val="center"/>
-        <w:rPr>
-          <w:rFonts w:ascii="Calibri" w:hAnsi="Calibri" w:cs="Calibri"/>
-        </w:rPr>
-      </w:pPr>
-    </w:p>
-    <w:p>
-      <w:pPr>
-        <w:jc w:val="center"/>
-        <w:rPr>
-          <w:rFonts w:ascii="Calibri" w:hAnsi="Calibri" w:cs="Calibri"/>
-          <w:b/>
-          <w:bCs/>
-          <w:color w:val="FF0000"/>
-        </w:rPr>
-      </w:pPr>
-      <w:r>
-        <w:rPr>
-          <w:rFonts w:ascii="Calibri" w:hAnsi="Calibri" w:cs="Calibri"/>
-        </w:rPr>
-        <w:t xml:space="preserve">This is app in </w:t>
-      </w:r>
-      <w:r>
-        <w:rPr>
-          <w:rFonts w:ascii="Calibri" w:hAnsi="Calibri" w:cs="Calibri"/>
-          <w:b/>
-          <w:bCs/>
-          <w:color w:val="FF0000"/>
-        </w:rPr>
-        <w:t>NOT FINISHED</w:t>
-      </w:r>
-    </w:p>
-    <w:p>
-      <w:pPr>
-        <w:jc w:val="center"/>
-        <w:rPr>
-          <w:rFonts w:ascii="Calibri" w:hAnsi="Calibri" w:cs="Calibri"/>
-        </w:rPr>
-      </w:pPr>
-      <w:r>
-        <w:rPr>
-          <w:rFonts w:ascii="Calibri" w:hAnsi="Calibri" w:cs="Calibri"/>
-        </w:rPr>
-        <w:t>(</w:t>
-      </w:r>
-      <w:r>
-        <w:rPr>
-          <w:rFonts w:ascii="Calibri" w:hAnsi="Calibri" w:cs="Calibri"/>
-        </w:rPr>
-        <w:t>Duration</w:t>
-      </w:r>
-      <w:r>
-        <w:rPr>
-          <w:rFonts w:ascii="Calibri" w:hAnsi="Calibri" w:cs="Calibri"/>
-        </w:rPr>
-        <w:t>:</w:t>
-      </w:r>
-      <w:r>
-        <w:rPr>
-          <w:rFonts w:ascii="Calibri" w:hAnsi="Calibri" w:cs="Calibri"/>
-        </w:rPr>
-        <w:t xml:space="preserve"> 24 Hour</w:t>
-      </w:r>
-      <w:r>
-        <w:rPr>
-          <w:rFonts w:ascii="Calibri" w:hAnsi="Calibri" w:cs="Calibri"/>
-        </w:rPr>
-        <w:t>)</w:t>
-      </w:r>
-    </w:p>
-    <w:p>
-      <w:pPr>
-        <w:jc w:val="center"/>
-        <w:rPr>
-          <w:rFonts w:ascii="Calibri" w:hAnsi="Calibri" w:cs="Calibri"/>
-        </w:rPr>
-      </w:pPr>
-    </w:p>
-    <w:p>
-      <w:pPr>
-        <w:rPr>
-          <w:rFonts w:ascii="Calibri" w:hAnsi="Calibri" w:cs="Calibri"/>
-          <w:b/>
-          <w:bCs/>
-          <w:color w:val="FF0000"/>
+        <w:spacing w:line="360" w:lineRule="auto"/>
+        <w:rPr>
+          <w:rFonts w:ascii="Calibri" w:hAnsi="Calibri" w:cs="Calibri"/>
         </w:rPr>
       </w:pPr>
     </w:p>
@@ -686,14 +604,12 @@
         </w:rPr>
         <w:t xml:space="preserve">, </w:t>
       </w:r>
-      <w:proofErr w:type="gramStart"/>
-      <w:r>
-        <w:rPr>
-          <w:rFonts w:ascii="Calibri" w:hAnsi="Calibri" w:cs="Calibri"/>
-        </w:rPr>
-        <w:t>If</w:t>
-      </w:r>
-      <w:proofErr w:type="gramEnd"/>
+      <w:r>
+        <w:rPr>
+          <w:rFonts w:ascii="Calibri" w:hAnsi="Calibri" w:cs="Calibri"/>
+        </w:rPr>
+        <w:t>if</w:t>
+      </w:r>
       <w:r>
         <w:rPr>
           <w:rFonts w:ascii="Calibri" w:hAnsi="Calibri" w:cs="Calibri"/>
@@ -744,30 +660,121 @@
         <w:rPr>
           <w:rFonts w:ascii="Calibri" w:hAnsi="Calibri" w:cs="Calibri"/>
         </w:rPr>
-        <w:lastRenderedPageBreak/>
-        <w:t xml:space="preserve">This App has been </w:t>
-      </w:r>
-      <w:r>
-        <w:rPr>
-          <w:rFonts w:ascii="Calibri" w:hAnsi="Calibri" w:cs="Calibri"/>
-        </w:rPr>
-        <w:t>tested</w:t>
-      </w:r>
-      <w:r>
-        <w:rPr>
-          <w:rFonts w:ascii="Calibri" w:hAnsi="Calibri" w:cs="Calibri"/>
-        </w:rPr>
-        <w:t xml:space="preserve"> for connecting to SQL Server, Fetch data from server, delete data</w:t>
-      </w:r>
-      <w:r>
-        <w:rPr>
-          <w:rFonts w:ascii="Calibri" w:hAnsi="Calibri" w:cs="Calibri"/>
-        </w:rPr>
-        <w:t>, and Add data to server</w:t>
-      </w:r>
-      <w:r>
-        <w:rPr>
-          <w:rFonts w:ascii="Calibri" w:hAnsi="Calibri" w:cs="Calibri"/>
+        <w:t xml:space="preserve">This </w:t>
+      </w:r>
+      <w:r>
+        <w:rPr>
+          <w:rFonts w:ascii="Calibri" w:hAnsi="Calibri" w:cs="Calibri"/>
+        </w:rPr>
+        <w:t>a</w:t>
+      </w:r>
+      <w:r>
+        <w:rPr>
+          <w:rFonts w:ascii="Calibri" w:hAnsi="Calibri" w:cs="Calibri"/>
+        </w:rPr>
+        <w:t xml:space="preserve">pp </w:t>
+      </w:r>
+      <w:r>
+        <w:rPr>
+          <w:rFonts w:ascii="Calibri" w:hAnsi="Calibri" w:cs="Calibri"/>
+        </w:rPr>
+        <w:t xml:space="preserve">can </w:t>
+      </w:r>
+      <w:r>
+        <w:rPr>
+          <w:rFonts w:ascii="Calibri" w:hAnsi="Calibri" w:cs="Calibri"/>
+        </w:rPr>
+        <w:t>add</w:t>
+      </w:r>
+      <w:r>
+        <w:rPr>
+          <w:rFonts w:ascii="Calibri" w:hAnsi="Calibri" w:cs="Calibri"/>
+        </w:rPr>
+        <w:t xml:space="preserve"> data, </w:t>
+      </w:r>
+      <w:r>
+        <w:rPr>
+          <w:rFonts w:ascii="Calibri" w:hAnsi="Calibri" w:cs="Calibri"/>
+        </w:rPr>
+        <w:t>fetch</w:t>
+      </w:r>
+      <w:r>
+        <w:rPr>
+          <w:rFonts w:ascii="Calibri" w:hAnsi="Calibri" w:cs="Calibri"/>
+        </w:rPr>
+        <w:t xml:space="preserve"> data</w:t>
+      </w:r>
+      <w:r>
+        <w:rPr>
+          <w:rFonts w:ascii="Calibri" w:hAnsi="Calibri" w:cs="Calibri"/>
+        </w:rPr>
+        <w:t xml:space="preserve">, </w:t>
+      </w:r>
+      <w:r>
+        <w:rPr>
+          <w:rFonts w:ascii="Calibri" w:hAnsi="Calibri" w:cs="Calibri"/>
+        </w:rPr>
+        <w:t>update</w:t>
+      </w:r>
+      <w:r>
+        <w:rPr>
+          <w:rFonts w:ascii="Calibri" w:hAnsi="Calibri" w:cs="Calibri"/>
+        </w:rPr>
+        <w:t xml:space="preserve"> data</w:t>
+      </w:r>
+      <w:r>
+        <w:rPr>
+          <w:rFonts w:ascii="Calibri" w:hAnsi="Calibri" w:cs="Calibri"/>
+        </w:rPr>
+        <w:t>,</w:t>
+      </w:r>
+      <w:r>
+        <w:rPr>
+          <w:rFonts w:ascii="Calibri" w:hAnsi="Calibri" w:cs="Calibri"/>
+        </w:rPr>
+        <w:t xml:space="preserve"> and</w:t>
+      </w:r>
+      <w:r>
+        <w:rPr>
+          <w:rFonts w:ascii="Calibri" w:hAnsi="Calibri" w:cs="Calibri"/>
+        </w:rPr>
+        <w:t xml:space="preserve"> </w:t>
+      </w:r>
+      <w:r>
+        <w:rPr>
+          <w:rFonts w:ascii="Calibri" w:hAnsi="Calibri" w:cs="Calibri"/>
+        </w:rPr>
+        <w:t>delete</w:t>
+      </w:r>
+      <w:r>
+        <w:rPr>
+          <w:rFonts w:ascii="Calibri" w:hAnsi="Calibri" w:cs="Calibri"/>
+        </w:rPr>
+        <w:t xml:space="preserve"> data</w:t>
+      </w:r>
+      <w:r>
+        <w:rPr>
+          <w:rFonts w:ascii="Calibri" w:hAnsi="Calibri" w:cs="Calibri"/>
+        </w:rPr>
+        <w:t xml:space="preserve"> </w:t>
+      </w:r>
+      <w:r>
+        <w:rPr>
+          <w:rFonts w:ascii="Calibri" w:hAnsi="Calibri" w:cs="Calibri"/>
+        </w:rPr>
+        <w:t xml:space="preserve">from </w:t>
+      </w:r>
+      <w:r>
+        <w:rPr>
+          <w:rFonts w:ascii="Calibri" w:hAnsi="Calibri" w:cs="Calibri"/>
+        </w:rPr>
+        <w:t>server</w:t>
+      </w:r>
+      <w:r>
+        <w:rPr>
+          <w:rFonts w:ascii="Calibri" w:hAnsi="Calibri" w:cs="Calibri"/>
+          <w:b/>
+          <w:bCs/>
         </w:rPr>
         <w:t>.</w:t>
       </w:r>
@@ -789,77 +796,22 @@
         <w:rPr>
           <w:rFonts w:ascii="Calibri" w:hAnsi="Calibri" w:cs="Calibri"/>
         </w:rPr>
-        <w:t>Task not finished:</w:t>
-      </w:r>
-    </w:p>
-    <w:p>
-      <w:pPr>
-        <w:pStyle w:val="ListParagraph"/>
-        <w:numPr>
-          <w:ilvl w:val="1"/>
-          <w:numId w:val="1"/>
-        </w:numPr>
-        <w:spacing w:line="360" w:lineRule="auto"/>
-        <w:jc w:val="both"/>
-        <w:rPr>
-          <w:rFonts w:ascii="Calibri" w:hAnsi="Calibri" w:cs="Calibri"/>
-        </w:rPr>
-      </w:pPr>
-      <w:r>
-        <w:rPr>
-          <w:rFonts w:ascii="Calibri" w:hAnsi="Calibri" w:cs="Calibri"/>
-        </w:rPr>
-        <w:t>Edit Data</w:t>
-      </w:r>
-    </w:p>
-    <w:p>
-      <w:pPr>
-        <w:pStyle w:val="ListParagraph"/>
-        <w:numPr>
-          <w:ilvl w:val="1"/>
-          <w:numId w:val="1"/>
-        </w:numPr>
-        <w:spacing w:line="360" w:lineRule="auto"/>
-        <w:jc w:val="both"/>
-        <w:rPr>
-          <w:rFonts w:ascii="Calibri" w:hAnsi="Calibri" w:cs="Calibri"/>
-        </w:rPr>
-      </w:pPr>
-      <w:r>
-        <w:rPr>
-          <w:rFonts w:ascii="Calibri" w:hAnsi="Calibri" w:cs="Calibri"/>
-        </w:rPr>
-        <w:t>Integrated to HTTP Client</w:t>
-      </w:r>
-    </w:p>
-    <w:p>
-      <w:pPr>
-        <w:pStyle w:val="ListParagraph"/>
-        <w:numPr>
-          <w:ilvl w:val="1"/>
-          <w:numId w:val="1"/>
-        </w:numPr>
-        <w:spacing w:line="360" w:lineRule="auto"/>
-        <w:jc w:val="both"/>
-        <w:rPr>
-          <w:rFonts w:ascii="Calibri" w:hAnsi="Calibri" w:cs="Calibri"/>
-        </w:rPr>
-      </w:pPr>
-      <w:r>
-        <w:rPr>
-          <w:rFonts w:ascii="Calibri" w:hAnsi="Calibri" w:cs="Calibri"/>
-        </w:rPr>
-        <w:t>Exception Handling</w:t>
-      </w:r>
-    </w:p>
-    <w:p>
-      <w:pPr>
-        <w:spacing w:line="360" w:lineRule="auto"/>
-        <w:jc w:val="both"/>
-        <w:rPr>
-          <w:rFonts w:ascii="Calibri" w:hAnsi="Calibri" w:cs="Calibri"/>
-        </w:rPr>
-      </w:pPr>
+        <w:t xml:space="preserve">App also can fetch and send data to and from external </w:t>
+      </w:r>
+      <w:proofErr w:type="spellStart"/>
+      <w:r>
+        <w:rPr>
+          <w:rFonts w:ascii="Calibri" w:hAnsi="Calibri" w:cs="Calibri"/>
+        </w:rPr>
+        <w:t>Url</w:t>
+      </w:r>
+      <w:proofErr w:type="spellEnd"/>
+      <w:r>
+        <w:rPr>
+          <w:rFonts w:ascii="Calibri" w:hAnsi="Calibri" w:cs="Calibri"/>
+        </w:rPr>
+        <w:t>.</w:t>
+      </w:r>
     </w:p>
     <w:p>
       <w:pPr>

</xml_diff>